<commit_message>
Add Assignment 4 counter implementations
Add behavioral 4-bit up/down counter designs with standard, synchronous-reset, and asynchronous-reset implementations.

Add exhaustive self-checking testbenches covering reset behavior, all 16 up-count transitions, all 16 down-count transitions, and 4-bit wraparound. Include VCD waveforms, compiled simulation artifacts, complete compile-and-run logs, screenshots, assignment materials, and README documentation with full verified output transcripts.

Update the Assignment 3 submission document and add its PDF export.
</commit_message>
<xml_diff>
--- a/DAY2/Assignment 3/Day3_Assignmnet_3_Submission.docx
+++ b/DAY2/Assignment 3/Day3_Assignmnet_3_Submission.docx
@@ -44,6 +44,17 @@
       <w:r>
         <w:t xml:space="preserve">GitHub Link : </w:t>
       </w:r>
+      <w:hyperlink r:id="rId5" w:history="1">
+        <w:r>
+          <w:rPr>
+            <w:rStyle w:val="Hyperlink"/>
+          </w:rPr>
+          <w:t>https://github.com/ssbagi/IBM_OpenPOWER_and_SoC_Design/tree/main/DAY2/Assignment%203</w:t>
+        </w:r>
+      </w:hyperlink>
+      <w:r>
+        <w:t xml:space="preserve"> </w:t>
+      </w:r>
     </w:p>
     <w:p>
       <w:pPr>
@@ -56,6 +67,17 @@
       <w:r>
         <w:t xml:space="preserve">README.md Link : </w:t>
       </w:r>
+      <w:hyperlink r:id="rId6" w:history="1">
+        <w:r>
+          <w:rPr>
+            <w:rStyle w:val="Hyperlink"/>
+          </w:rPr>
+          <w:t>https://github.com/ssbagi/IBM_OpenPOWER_and_SoC_Design/blob/main/DAY2/Assignment%203/README.md</w:t>
+        </w:r>
+      </w:hyperlink>
+      <w:r>
+        <w:t xml:space="preserve"> </w:t>
+      </w:r>
     </w:p>
     <w:p>
       <w:pPr>
@@ -66,6 +88,16 @@
       <w:pPr>
         <w:ind w:left="360"/>
       </w:pPr>
+      <w:r>
+        <w:rPr>
+          <w:b/>
+          <w:bCs/>
+        </w:rPr>
+        <w:t>Question 1 :</w:t>
+      </w:r>
+      <w:r>
+        <w:t xml:space="preserve"> </w:t>
+      </w:r>
       <w:r>
         <w:t>Design and Simulate 4-bit BCD to Excess-3 code converter using Verilog HDL and verify its operation through simulation.</w:t>
       </w:r>
@@ -196,454 +228,6 @@
                 <pic:pic xmlns:pic="http://schemas.openxmlformats.org/drawingml/2006/picture">
                   <pic:nvPicPr>
                     <pic:cNvPr id="0" name="Picture 1"/>
-                    <pic:cNvPicPr>
-                      <a:picLocks noChangeAspect="1" noChangeArrowheads="1"/>
-                    </pic:cNvPicPr>
-                  </pic:nvPicPr>
-                  <pic:blipFill>
-                    <a:blip r:embed="rId5" cstate="print">
-                      <a:extLst>
-                        <a:ext uri="{28A0092B-C50C-407E-A947-70E740481C1C}">
-                          <a14:useLocalDpi xmlns:a14="http://schemas.microsoft.com/office/drawing/2010/main" val="0"/>
-                        </a:ext>
-                      </a:extLst>
-                    </a:blip>
-                    <a:srcRect/>
-                    <a:stretch>
-                      <a:fillRect/>
-                    </a:stretch>
-                  </pic:blipFill>
-                  <pic:spPr bwMode="auto">
-                    <a:xfrm>
-                      <a:off x="0" y="0"/>
-                      <a:ext cx="5731510" cy="3220085"/>
-                    </a:xfrm>
-                    <a:prstGeom prst="rect">
-                      <a:avLst/>
-                    </a:prstGeom>
-                    <a:noFill/>
-                    <a:ln>
-                      <a:noFill/>
-                    </a:ln>
-                  </pic:spPr>
-                </pic:pic>
-              </a:graphicData>
-            </a:graphic>
-          </wp:inline>
-        </w:drawing>
-      </w:r>
-    </w:p>
-    <w:p>
-      <w:pPr>
-        <w:pStyle w:val="ListParagraph"/>
-      </w:pPr>
-    </w:p>
-    <w:p>
-      <w:pPr>
-        <w:pStyle w:val="ListParagraph"/>
-      </w:pPr>
-    </w:p>
-    <w:p>
-      <w:pPr>
-        <w:pStyle w:val="ListParagraph"/>
-        <w:rPr>
-          <w:b/>
-          <w:bCs/>
-        </w:rPr>
-      </w:pPr>
-    </w:p>
-    <w:p>
-      <w:pPr>
-        <w:pStyle w:val="ListParagraph"/>
-        <w:rPr>
-          <w:b/>
-          <w:bCs/>
-        </w:rPr>
-      </w:pPr>
-    </w:p>
-    <w:p>
-      <w:pPr>
-        <w:pStyle w:val="ListParagraph"/>
-        <w:rPr>
-          <w:b/>
-          <w:bCs/>
-        </w:rPr>
-      </w:pPr>
-    </w:p>
-    <w:p>
-      <w:pPr>
-        <w:pStyle w:val="ListParagraph"/>
-        <w:rPr>
-          <w:b/>
-          <w:bCs/>
-        </w:rPr>
-      </w:pPr>
-    </w:p>
-    <w:p>
-      <w:pPr>
-        <w:pStyle w:val="ListParagraph"/>
-        <w:rPr>
-          <w:b/>
-          <w:bCs/>
-        </w:rPr>
-      </w:pPr>
-    </w:p>
-    <w:p>
-      <w:pPr>
-        <w:pStyle w:val="ListParagraph"/>
-        <w:rPr>
-          <w:b/>
-          <w:bCs/>
-        </w:rPr>
-      </w:pPr>
-    </w:p>
-    <w:p>
-      <w:pPr>
-        <w:pStyle w:val="ListParagraph"/>
-        <w:rPr>
-          <w:b/>
-          <w:bCs/>
-        </w:rPr>
-      </w:pPr>
-    </w:p>
-    <w:p>
-      <w:pPr>
-        <w:pStyle w:val="ListParagraph"/>
-        <w:rPr>
-          <w:b/>
-          <w:bCs/>
-        </w:rPr>
-      </w:pPr>
-      <w:r>
-        <w:rPr>
-          <w:b/>
-          <w:bCs/>
-        </w:rPr>
-        <w:t xml:space="preserve">Simulation : </w:t>
-      </w:r>
-    </w:p>
-    <w:p>
-      <w:pPr>
-        <w:pStyle w:val="ListParagraph"/>
-      </w:pPr>
-    </w:p>
-    <w:p>
-      <w:pPr>
-        <w:pStyle w:val="ListParagraph"/>
-      </w:pPr>
-      <w:r>
-        <w:rPr>
-          <w:noProof/>
-        </w:rPr>
-        <w:drawing>
-          <wp:inline distT="0" distB="0" distL="0" distR="0" wp14:anchorId="7FE3DEA0" wp14:editId="10AAD909">
-            <wp:extent cx="5731510" cy="3220085"/>
-            <wp:effectExtent l="0" t="0" r="2540" b="0"/>
-            <wp:docPr id="181207226" name="Picture 2"/>
-            <wp:cNvGraphicFramePr>
-              <a:graphicFrameLocks xmlns:a="http://schemas.openxmlformats.org/drawingml/2006/main" noChangeAspect="1"/>
-            </wp:cNvGraphicFramePr>
-            <a:graphic xmlns:a="http://schemas.openxmlformats.org/drawingml/2006/main">
-              <a:graphicData uri="http://schemas.openxmlformats.org/drawingml/2006/picture">
-                <pic:pic xmlns:pic="http://schemas.openxmlformats.org/drawingml/2006/picture">
-                  <pic:nvPicPr>
-                    <pic:cNvPr id="0" name="Picture 3"/>
-                    <pic:cNvPicPr>
-                      <a:picLocks noChangeAspect="1" noChangeArrowheads="1"/>
-                    </pic:cNvPicPr>
-                  </pic:nvPicPr>
-                  <pic:blipFill>
-                    <a:blip r:embed="rId6" cstate="print">
-                      <a:extLst>
-                        <a:ext uri="{28A0092B-C50C-407E-A947-70E740481C1C}">
-                          <a14:useLocalDpi xmlns:a14="http://schemas.microsoft.com/office/drawing/2010/main" val="0"/>
-                        </a:ext>
-                      </a:extLst>
-                    </a:blip>
-                    <a:srcRect/>
-                    <a:stretch>
-                      <a:fillRect/>
-                    </a:stretch>
-                  </pic:blipFill>
-                  <pic:spPr bwMode="auto">
-                    <a:xfrm>
-                      <a:off x="0" y="0"/>
-                      <a:ext cx="5731510" cy="3220085"/>
-                    </a:xfrm>
-                    <a:prstGeom prst="rect">
-                      <a:avLst/>
-                    </a:prstGeom>
-                    <a:noFill/>
-                    <a:ln>
-                      <a:noFill/>
-                    </a:ln>
-                  </pic:spPr>
-                </pic:pic>
-              </a:graphicData>
-            </a:graphic>
-          </wp:inline>
-        </w:drawing>
-      </w:r>
-    </w:p>
-    <w:p/>
-    <w:p>
-      <w:pPr>
-        <w:pStyle w:val="ListParagraph"/>
-        <w:numPr>
-          <w:ilvl w:val="0"/>
-          <w:numId w:val="1"/>
-        </w:numPr>
-      </w:pPr>
-      <w:r>
-        <w:t>Design and simulate a Verilog module that converts a 4-bit BCD input into the corresponding seven segment display outputs</w:t>
-      </w:r>
-      <w:r>
-        <w:t>.</w:t>
-      </w:r>
-    </w:p>
-    <w:p>
-      <w:pPr>
-        <w:pStyle w:val="ListParagraph"/>
-      </w:pPr>
-    </w:p>
-    <w:p>
-      <w:pPr>
-        <w:pStyle w:val="ListParagraph"/>
-        <w:rPr>
-          <w:b/>
-          <w:bCs/>
-        </w:rPr>
-      </w:pPr>
-      <w:r>
-        <w:rPr>
-          <w:b/>
-          <w:bCs/>
-        </w:rPr>
-        <w:t>Verilog code :</w:t>
-      </w:r>
-    </w:p>
-    <w:p>
-      <w:pPr>
-        <w:pStyle w:val="ListParagraph"/>
-      </w:pPr>
-      <w:r>
-        <w:t>module bcd_to_seven_segment_dataflow (</w:t>
-      </w:r>
-    </w:p>
-    <w:p>
-      <w:pPr>
-        <w:pStyle w:val="ListParagraph"/>
-      </w:pPr>
-      <w:r>
-        <w:t xml:space="preserve">    input  [3:0] bcd,</w:t>
-      </w:r>
-    </w:p>
-    <w:p>
-      <w:pPr>
-        <w:pStyle w:val="ListParagraph"/>
-      </w:pPr>
-      <w:r>
-        <w:t xml:space="preserve">    output reg [6:0] segment</w:t>
-      </w:r>
-    </w:p>
-    <w:p>
-      <w:pPr>
-        <w:pStyle w:val="ListParagraph"/>
-      </w:pPr>
-      <w:r>
-        <w:t>);</w:t>
-      </w:r>
-    </w:p>
-    <w:p>
-      <w:pPr>
-        <w:pStyle w:val="ListParagraph"/>
-      </w:pPr>
-    </w:p>
-    <w:p>
-      <w:pPr>
-        <w:pStyle w:val="ListParagraph"/>
-      </w:pPr>
-      <w:r>
-        <w:t xml:space="preserve">    always @(*) begin</w:t>
-      </w:r>
-    </w:p>
-    <w:p>
-      <w:pPr>
-        <w:pStyle w:val="ListParagraph"/>
-      </w:pPr>
-      <w:r>
-        <w:t xml:space="preserve">        case (bcd)</w:t>
-      </w:r>
-    </w:p>
-    <w:p>
-      <w:pPr>
-        <w:pStyle w:val="ListParagraph"/>
-      </w:pPr>
-      <w:r>
-        <w:t xml:space="preserve">            4'd0:    segment = 7'b0111111;</w:t>
-      </w:r>
-    </w:p>
-    <w:p>
-      <w:pPr>
-        <w:pStyle w:val="ListParagraph"/>
-      </w:pPr>
-      <w:r>
-        <w:t xml:space="preserve">            4'd1:    segment = 7'b0000110;</w:t>
-      </w:r>
-    </w:p>
-    <w:p>
-      <w:pPr>
-        <w:pStyle w:val="ListParagraph"/>
-      </w:pPr>
-      <w:r>
-        <w:t xml:space="preserve">            4'd2:    segment = 7'b1011011;</w:t>
-      </w:r>
-    </w:p>
-    <w:p>
-      <w:pPr>
-        <w:pStyle w:val="ListParagraph"/>
-      </w:pPr>
-      <w:r>
-        <w:t xml:space="preserve">            4'd3:    segment = 7'b1001111;</w:t>
-      </w:r>
-    </w:p>
-    <w:p>
-      <w:pPr>
-        <w:pStyle w:val="ListParagraph"/>
-      </w:pPr>
-      <w:r>
-        <w:t xml:space="preserve">            4'd4:    segment = 7'b1100110;</w:t>
-      </w:r>
-    </w:p>
-    <w:p>
-      <w:pPr>
-        <w:pStyle w:val="ListParagraph"/>
-      </w:pPr>
-      <w:r>
-        <w:t xml:space="preserve">            4'd5:    segment = 7'b1101101;</w:t>
-      </w:r>
-    </w:p>
-    <w:p>
-      <w:pPr>
-        <w:pStyle w:val="ListParagraph"/>
-      </w:pPr>
-      <w:r>
-        <w:lastRenderedPageBreak/>
-        <w:t xml:space="preserve">            4'd6:    segment = 7'b1111101;</w:t>
-      </w:r>
-    </w:p>
-    <w:p>
-      <w:pPr>
-        <w:pStyle w:val="ListParagraph"/>
-      </w:pPr>
-      <w:r>
-        <w:t xml:space="preserve">            4'd7:    segment = 7'b0000111;</w:t>
-      </w:r>
-    </w:p>
-    <w:p>
-      <w:pPr>
-        <w:pStyle w:val="ListParagraph"/>
-      </w:pPr>
-      <w:r>
-        <w:t xml:space="preserve">            4'd8:    segment = 7'b1111111;</w:t>
-      </w:r>
-    </w:p>
-    <w:p>
-      <w:pPr>
-        <w:pStyle w:val="ListParagraph"/>
-      </w:pPr>
-      <w:r>
-        <w:t xml:space="preserve">            4'd9:    segment = 7'b1101111;</w:t>
-      </w:r>
-    </w:p>
-    <w:p>
-      <w:pPr>
-        <w:pStyle w:val="ListParagraph"/>
-      </w:pPr>
-      <w:r>
-        <w:t xml:space="preserve">            default: segment = 7'b0000000;</w:t>
-      </w:r>
-    </w:p>
-    <w:p>
-      <w:pPr>
-        <w:pStyle w:val="ListParagraph"/>
-      </w:pPr>
-      <w:r>
-        <w:t xml:space="preserve">        endcase</w:t>
-      </w:r>
-    </w:p>
-    <w:p>
-      <w:pPr>
-        <w:pStyle w:val="ListParagraph"/>
-      </w:pPr>
-      <w:r>
-        <w:t xml:space="preserve">    end</w:t>
-      </w:r>
-    </w:p>
-    <w:p>
-      <w:pPr>
-        <w:pStyle w:val="ListParagraph"/>
-      </w:pPr>
-    </w:p>
-    <w:p>
-      <w:pPr>
-        <w:pStyle w:val="ListParagraph"/>
-      </w:pPr>
-      <w:r>
-        <w:t>endmodule</w:t>
-      </w:r>
-    </w:p>
-    <w:p>
-      <w:pPr>
-        <w:pStyle w:val="ListParagraph"/>
-      </w:pPr>
-    </w:p>
-    <w:p>
-      <w:pPr>
-        <w:pStyle w:val="ListParagraph"/>
-        <w:rPr>
-          <w:b/>
-          <w:bCs/>
-        </w:rPr>
-      </w:pPr>
-      <w:r>
-        <w:rPr>
-          <w:b/>
-          <w:bCs/>
-        </w:rPr>
-        <w:t>Compilation :</w:t>
-      </w:r>
-    </w:p>
-    <w:p>
-      <w:pPr>
-        <w:pStyle w:val="ListParagraph"/>
-        <w:rPr>
-          <w:b/>
-          <w:bCs/>
-        </w:rPr>
-      </w:pPr>
-    </w:p>
-    <w:p>
-      <w:pPr>
-        <w:pStyle w:val="ListParagraph"/>
-      </w:pPr>
-      <w:r>
-        <w:rPr>
-          <w:noProof/>
-        </w:rPr>
-        <w:drawing>
-          <wp:inline distT="0" distB="0" distL="0" distR="0" wp14:anchorId="41308002" wp14:editId="778B4965">
-            <wp:extent cx="5731510" cy="3220085"/>
-            <wp:effectExtent l="0" t="0" r="2540" b="0"/>
-            <wp:docPr id="1823169598" name="Picture 3"/>
-            <wp:cNvGraphicFramePr>
-              <a:graphicFrameLocks xmlns:a="http://schemas.openxmlformats.org/drawingml/2006/main" noChangeAspect="1"/>
-            </wp:cNvGraphicFramePr>
-            <a:graphic xmlns:a="http://schemas.openxmlformats.org/drawingml/2006/main">
-              <a:graphicData uri="http://schemas.openxmlformats.org/drawingml/2006/picture">
-                <pic:pic xmlns:pic="http://schemas.openxmlformats.org/drawingml/2006/picture">
-                  <pic:nvPicPr>
-                    <pic:cNvPr id="0" name="Picture 5"/>
                     <pic:cNvPicPr>
                       <a:picLocks noChangeAspect="1" noChangeArrowheads="1"/>
                     </pic:cNvPicPr>
@@ -683,57 +267,38 @@
     </w:p>
     <w:p>
       <w:pPr>
-        <w:pStyle w:val="ListParagraph"/>
-      </w:pPr>
-    </w:p>
-    <w:p>
-      <w:pPr>
-        <w:pStyle w:val="ListParagraph"/>
-      </w:pPr>
-    </w:p>
-    <w:p>
-      <w:pPr>
-        <w:pStyle w:val="ListParagraph"/>
-        <w:rPr>
-          <w:b/>
-          <w:bCs/>
-        </w:rPr>
-      </w:pPr>
-      <w:r>
-        <w:rPr>
-          <w:b/>
-          <w:bCs/>
-        </w:rPr>
-        <w:t>Simulation :</w:t>
-      </w:r>
-    </w:p>
-    <w:p>
-      <w:pPr>
-        <w:pStyle w:val="ListParagraph"/>
-        <w:rPr>
-          <w:b/>
-          <w:bCs/>
-        </w:rPr>
-      </w:pPr>
-    </w:p>
-    <w:p>
-      <w:pPr>
-        <w:pStyle w:val="ListParagraph"/>
-        <w:rPr>
-          <w:b/>
-          <w:bCs/>
-        </w:rPr>
+        <w:rPr>
+          <w:b/>
+          <w:bCs/>
+        </w:rPr>
+      </w:pPr>
+      <w:r>
+        <w:rPr>
+          <w:b/>
+          <w:bCs/>
+        </w:rPr>
+        <w:lastRenderedPageBreak/>
+        <w:t xml:space="preserve">Simulation : </w:t>
+      </w:r>
+    </w:p>
+    <w:p>
+      <w:pPr>
+        <w:pStyle w:val="ListParagraph"/>
+      </w:pPr>
+    </w:p>
+    <w:p>
+      <w:pPr>
+        <w:pStyle w:val="ListParagraph"/>
       </w:pPr>
       <w:r>
         <w:rPr>
           <w:noProof/>
         </w:rPr>
-        <w:lastRenderedPageBreak/>
         <w:drawing>
-          <wp:inline distT="0" distB="0" distL="0" distR="0" wp14:anchorId="7058096C" wp14:editId="5A213FA3">
+          <wp:inline distT="0" distB="0" distL="0" distR="0" wp14:anchorId="7FE3DEA0" wp14:editId="10AAD909">
             <wp:extent cx="5731510" cy="3220085"/>
             <wp:effectExtent l="0" t="0" r="2540" b="0"/>
-            <wp:docPr id="1336011071" name="Picture 4"/>
+            <wp:docPr id="181207226" name="Picture 2"/>
             <wp:cNvGraphicFramePr>
               <a:graphicFrameLocks xmlns:a="http://schemas.openxmlformats.org/drawingml/2006/main" noChangeAspect="1"/>
             </wp:cNvGraphicFramePr>
@@ -741,7 +306,7 @@
               <a:graphicData uri="http://schemas.openxmlformats.org/drawingml/2006/picture">
                 <pic:pic xmlns:pic="http://schemas.openxmlformats.org/drawingml/2006/picture">
                   <pic:nvPicPr>
-                    <pic:cNvPr id="0" name="Picture 7"/>
+                    <pic:cNvPr id="0" name="Picture 3"/>
                     <pic:cNvPicPr>
                       <a:picLocks noChangeAspect="1" noChangeArrowheads="1"/>
                     </pic:cNvPicPr>
@@ -778,6 +343,735 @@
           </wp:inline>
         </w:drawing>
       </w:r>
+    </w:p>
+    <w:p/>
+    <w:p>
+      <w:pPr>
+        <w:pStyle w:val="ListParagraph"/>
+        <w:rPr>
+          <w:b/>
+          <w:bCs/>
+        </w:rPr>
+      </w:pPr>
+    </w:p>
+    <w:p>
+      <w:pPr>
+        <w:pStyle w:val="ListParagraph"/>
+        <w:rPr>
+          <w:b/>
+          <w:bCs/>
+        </w:rPr>
+      </w:pPr>
+    </w:p>
+    <w:p>
+      <w:pPr>
+        <w:pStyle w:val="ListParagraph"/>
+        <w:rPr>
+          <w:b/>
+          <w:bCs/>
+        </w:rPr>
+      </w:pPr>
+    </w:p>
+    <w:p>
+      <w:pPr>
+        <w:pStyle w:val="ListParagraph"/>
+        <w:rPr>
+          <w:b/>
+          <w:bCs/>
+        </w:rPr>
+      </w:pPr>
+    </w:p>
+    <w:p>
+      <w:pPr>
+        <w:pStyle w:val="ListParagraph"/>
+        <w:rPr>
+          <w:b/>
+          <w:bCs/>
+        </w:rPr>
+      </w:pPr>
+    </w:p>
+    <w:p>
+      <w:pPr>
+        <w:pStyle w:val="ListParagraph"/>
+        <w:rPr>
+          <w:b/>
+          <w:bCs/>
+        </w:rPr>
+      </w:pPr>
+    </w:p>
+    <w:p>
+      <w:pPr>
+        <w:pStyle w:val="ListParagraph"/>
+        <w:rPr>
+          <w:b/>
+          <w:bCs/>
+        </w:rPr>
+      </w:pPr>
+    </w:p>
+    <w:p>
+      <w:pPr>
+        <w:pStyle w:val="ListParagraph"/>
+        <w:rPr>
+          <w:b/>
+          <w:bCs/>
+        </w:rPr>
+      </w:pPr>
+    </w:p>
+    <w:p>
+      <w:pPr>
+        <w:pStyle w:val="ListParagraph"/>
+        <w:rPr>
+          <w:b/>
+          <w:bCs/>
+        </w:rPr>
+      </w:pPr>
+    </w:p>
+    <w:p>
+      <w:pPr>
+        <w:pStyle w:val="ListParagraph"/>
+        <w:rPr>
+          <w:b/>
+          <w:bCs/>
+        </w:rPr>
+      </w:pPr>
+    </w:p>
+    <w:p>
+      <w:pPr>
+        <w:pStyle w:val="ListParagraph"/>
+        <w:rPr>
+          <w:b/>
+          <w:bCs/>
+        </w:rPr>
+      </w:pPr>
+    </w:p>
+    <w:p>
+      <w:pPr>
+        <w:pStyle w:val="ListParagraph"/>
+        <w:rPr>
+          <w:b/>
+          <w:bCs/>
+        </w:rPr>
+      </w:pPr>
+    </w:p>
+    <w:p>
+      <w:pPr>
+        <w:pStyle w:val="ListParagraph"/>
+        <w:rPr>
+          <w:b/>
+          <w:bCs/>
+        </w:rPr>
+      </w:pPr>
+    </w:p>
+    <w:p>
+      <w:pPr>
+        <w:pStyle w:val="ListParagraph"/>
+        <w:rPr>
+          <w:b/>
+          <w:bCs/>
+        </w:rPr>
+      </w:pPr>
+    </w:p>
+    <w:p>
+      <w:pPr>
+        <w:pStyle w:val="ListParagraph"/>
+        <w:rPr>
+          <w:b/>
+          <w:bCs/>
+        </w:rPr>
+      </w:pPr>
+    </w:p>
+    <w:p>
+      <w:pPr>
+        <w:pStyle w:val="ListParagraph"/>
+        <w:rPr>
+          <w:b/>
+          <w:bCs/>
+        </w:rPr>
+      </w:pPr>
+    </w:p>
+    <w:p>
+      <w:pPr>
+        <w:pStyle w:val="ListParagraph"/>
+        <w:rPr>
+          <w:b/>
+          <w:bCs/>
+        </w:rPr>
+      </w:pPr>
+    </w:p>
+    <w:p>
+      <w:pPr>
+        <w:pStyle w:val="ListParagraph"/>
+        <w:rPr>
+          <w:b/>
+          <w:bCs/>
+        </w:rPr>
+      </w:pPr>
+    </w:p>
+    <w:p>
+      <w:pPr>
+        <w:pStyle w:val="ListParagraph"/>
+        <w:rPr>
+          <w:b/>
+          <w:bCs/>
+        </w:rPr>
+      </w:pPr>
+    </w:p>
+    <w:p>
+      <w:pPr>
+        <w:pStyle w:val="ListParagraph"/>
+        <w:rPr>
+          <w:b/>
+          <w:bCs/>
+        </w:rPr>
+      </w:pPr>
+    </w:p>
+    <w:p>
+      <w:pPr>
+        <w:pStyle w:val="ListParagraph"/>
+      </w:pPr>
+      <w:r>
+        <w:rPr>
+          <w:b/>
+          <w:bCs/>
+        </w:rPr>
+        <w:lastRenderedPageBreak/>
+        <w:t xml:space="preserve">Question </w:t>
+      </w:r>
+      <w:r>
+        <w:rPr>
+          <w:b/>
+          <w:bCs/>
+        </w:rPr>
+        <w:t>2</w:t>
+      </w:r>
+      <w:r>
+        <w:rPr>
+          <w:b/>
+          <w:bCs/>
+        </w:rPr>
+        <w:t xml:space="preserve"> :</w:t>
+      </w:r>
+      <w:r>
+        <w:t xml:space="preserve"> </w:t>
+      </w:r>
+      <w:r>
+        <w:t>Design and simulate a Verilog module that converts a 4-bit BCD input into the corresponding seven segment display outputs</w:t>
+      </w:r>
+      <w:r>
+        <w:t>.</w:t>
+      </w:r>
+    </w:p>
+    <w:p>
+      <w:pPr>
+        <w:pStyle w:val="ListParagraph"/>
+      </w:pPr>
+    </w:p>
+    <w:p>
+      <w:pPr>
+        <w:pStyle w:val="ListParagraph"/>
+        <w:rPr>
+          <w:b/>
+          <w:bCs/>
+        </w:rPr>
+      </w:pPr>
+      <w:r>
+        <w:rPr>
+          <w:b/>
+          <w:bCs/>
+        </w:rPr>
+        <w:t>Verilog code :</w:t>
+      </w:r>
+    </w:p>
+    <w:p>
+      <w:pPr>
+        <w:pStyle w:val="ListParagraph"/>
+      </w:pPr>
+      <w:r>
+        <w:t>module bcd_to_seven_segment_dataflow (</w:t>
+      </w:r>
+    </w:p>
+    <w:p>
+      <w:pPr>
+        <w:pStyle w:val="ListParagraph"/>
+      </w:pPr>
+      <w:r>
+        <w:t xml:space="preserve">    input  [3:0] bcd,</w:t>
+      </w:r>
+    </w:p>
+    <w:p>
+      <w:pPr>
+        <w:pStyle w:val="ListParagraph"/>
+      </w:pPr>
+      <w:r>
+        <w:t xml:space="preserve">    output reg [6:0] segment</w:t>
+      </w:r>
+    </w:p>
+    <w:p>
+      <w:pPr>
+        <w:pStyle w:val="ListParagraph"/>
+      </w:pPr>
+      <w:r>
+        <w:t>);</w:t>
+      </w:r>
+    </w:p>
+    <w:p>
+      <w:pPr>
+        <w:pStyle w:val="ListParagraph"/>
+      </w:pPr>
+    </w:p>
+    <w:p>
+      <w:pPr>
+        <w:pStyle w:val="ListParagraph"/>
+      </w:pPr>
+      <w:r>
+        <w:t xml:space="preserve">    always @(*) begin</w:t>
+      </w:r>
+    </w:p>
+    <w:p>
+      <w:pPr>
+        <w:pStyle w:val="ListParagraph"/>
+      </w:pPr>
+      <w:r>
+        <w:t xml:space="preserve">        case (bcd)</w:t>
+      </w:r>
+    </w:p>
+    <w:p>
+      <w:pPr>
+        <w:pStyle w:val="ListParagraph"/>
+      </w:pPr>
+      <w:r>
+        <w:t xml:space="preserve">            4'd0:    segment = 7'b0111111;</w:t>
+      </w:r>
+    </w:p>
+    <w:p>
+      <w:pPr>
+        <w:pStyle w:val="ListParagraph"/>
+      </w:pPr>
+      <w:r>
+        <w:t xml:space="preserve">            4'd1:    segment = 7'b0000110;</w:t>
+      </w:r>
+    </w:p>
+    <w:p>
+      <w:pPr>
+        <w:pStyle w:val="ListParagraph"/>
+      </w:pPr>
+      <w:r>
+        <w:t xml:space="preserve">            4'd2:    segment = 7'b1011011;</w:t>
+      </w:r>
+    </w:p>
+    <w:p>
+      <w:pPr>
+        <w:pStyle w:val="ListParagraph"/>
+      </w:pPr>
+      <w:r>
+        <w:t xml:space="preserve">            4'd3:    segment = 7'b1001111;</w:t>
+      </w:r>
+    </w:p>
+    <w:p>
+      <w:pPr>
+        <w:pStyle w:val="ListParagraph"/>
+      </w:pPr>
+      <w:r>
+        <w:t xml:space="preserve">            4'd4:    segment = 7'b1100110;</w:t>
+      </w:r>
+    </w:p>
+    <w:p>
+      <w:pPr>
+        <w:pStyle w:val="ListParagraph"/>
+      </w:pPr>
+      <w:r>
+        <w:t xml:space="preserve">            4'd5:    segment = 7'b1101101;</w:t>
+      </w:r>
+    </w:p>
+    <w:p>
+      <w:pPr>
+        <w:pStyle w:val="ListParagraph"/>
+      </w:pPr>
+      <w:r>
+        <w:t xml:space="preserve">            4'd6:    segment = 7'b1111101;</w:t>
+      </w:r>
+    </w:p>
+    <w:p>
+      <w:pPr>
+        <w:pStyle w:val="ListParagraph"/>
+      </w:pPr>
+      <w:r>
+        <w:t xml:space="preserve">            4'd7:    segment = 7'b0000111;</w:t>
+      </w:r>
+    </w:p>
+    <w:p>
+      <w:pPr>
+        <w:pStyle w:val="ListParagraph"/>
+      </w:pPr>
+      <w:r>
+        <w:t xml:space="preserve">            4'd8:    segment = 7'b1111111;</w:t>
+      </w:r>
+    </w:p>
+    <w:p>
+      <w:pPr>
+        <w:pStyle w:val="ListParagraph"/>
+      </w:pPr>
+      <w:r>
+        <w:t xml:space="preserve">            4'd9:    segment = 7'b1101111;</w:t>
+      </w:r>
+    </w:p>
+    <w:p>
+      <w:pPr>
+        <w:pStyle w:val="ListParagraph"/>
+      </w:pPr>
+      <w:r>
+        <w:t xml:space="preserve">            default: segment = 7'b0000000;</w:t>
+      </w:r>
+    </w:p>
+    <w:p>
+      <w:pPr>
+        <w:pStyle w:val="ListParagraph"/>
+      </w:pPr>
+      <w:r>
+        <w:t xml:space="preserve">        endcase</w:t>
+      </w:r>
+    </w:p>
+    <w:p>
+      <w:pPr>
+        <w:pStyle w:val="ListParagraph"/>
+      </w:pPr>
+      <w:r>
+        <w:t xml:space="preserve">    end</w:t>
+      </w:r>
+    </w:p>
+    <w:p>
+      <w:pPr>
+        <w:pStyle w:val="ListParagraph"/>
+      </w:pPr>
+    </w:p>
+    <w:p>
+      <w:pPr>
+        <w:pStyle w:val="ListParagraph"/>
+      </w:pPr>
+      <w:r>
+        <w:t>endmodule</w:t>
+      </w:r>
+    </w:p>
+    <w:p>
+      <w:pPr>
+        <w:pStyle w:val="ListParagraph"/>
+      </w:pPr>
+    </w:p>
+    <w:p>
+      <w:pPr>
+        <w:pStyle w:val="ListParagraph"/>
+        <w:rPr>
+          <w:b/>
+          <w:bCs/>
+        </w:rPr>
+      </w:pPr>
+    </w:p>
+    <w:p>
+      <w:pPr>
+        <w:pStyle w:val="ListParagraph"/>
+        <w:rPr>
+          <w:b/>
+          <w:bCs/>
+        </w:rPr>
+      </w:pPr>
+    </w:p>
+    <w:p>
+      <w:pPr>
+        <w:pStyle w:val="ListParagraph"/>
+        <w:rPr>
+          <w:b/>
+          <w:bCs/>
+        </w:rPr>
+      </w:pPr>
+    </w:p>
+    <w:p>
+      <w:pPr>
+        <w:pStyle w:val="ListParagraph"/>
+        <w:rPr>
+          <w:b/>
+          <w:bCs/>
+        </w:rPr>
+      </w:pPr>
+    </w:p>
+    <w:p>
+      <w:pPr>
+        <w:pStyle w:val="ListParagraph"/>
+        <w:rPr>
+          <w:b/>
+          <w:bCs/>
+        </w:rPr>
+      </w:pPr>
+    </w:p>
+    <w:p>
+      <w:pPr>
+        <w:pStyle w:val="ListParagraph"/>
+        <w:rPr>
+          <w:b/>
+          <w:bCs/>
+        </w:rPr>
+      </w:pPr>
+    </w:p>
+    <w:p>
+      <w:pPr>
+        <w:pStyle w:val="ListParagraph"/>
+        <w:rPr>
+          <w:b/>
+          <w:bCs/>
+        </w:rPr>
+      </w:pPr>
+    </w:p>
+    <w:p>
+      <w:pPr>
+        <w:pStyle w:val="ListParagraph"/>
+        <w:rPr>
+          <w:b/>
+          <w:bCs/>
+        </w:rPr>
+      </w:pPr>
+    </w:p>
+    <w:p>
+      <w:pPr>
+        <w:pStyle w:val="ListParagraph"/>
+        <w:rPr>
+          <w:b/>
+          <w:bCs/>
+        </w:rPr>
+      </w:pPr>
+    </w:p>
+    <w:p>
+      <w:pPr>
+        <w:pStyle w:val="ListParagraph"/>
+        <w:rPr>
+          <w:b/>
+          <w:bCs/>
+        </w:rPr>
+      </w:pPr>
+    </w:p>
+    <w:p>
+      <w:pPr>
+        <w:pStyle w:val="ListParagraph"/>
+        <w:rPr>
+          <w:b/>
+          <w:bCs/>
+        </w:rPr>
+      </w:pPr>
+    </w:p>
+    <w:p>
+      <w:pPr>
+        <w:pStyle w:val="ListParagraph"/>
+        <w:rPr>
+          <w:b/>
+          <w:bCs/>
+        </w:rPr>
+      </w:pPr>
+    </w:p>
+    <w:p>
+      <w:pPr>
+        <w:pStyle w:val="ListParagraph"/>
+        <w:rPr>
+          <w:b/>
+          <w:bCs/>
+        </w:rPr>
+      </w:pPr>
+    </w:p>
+    <w:p>
+      <w:pPr>
+        <w:pStyle w:val="ListParagraph"/>
+        <w:rPr>
+          <w:b/>
+          <w:bCs/>
+        </w:rPr>
+      </w:pPr>
+    </w:p>
+    <w:p>
+      <w:pPr>
+        <w:pStyle w:val="ListParagraph"/>
+        <w:rPr>
+          <w:b/>
+          <w:bCs/>
+        </w:rPr>
+      </w:pPr>
+      <w:r>
+        <w:rPr>
+          <w:b/>
+          <w:bCs/>
+        </w:rPr>
+        <w:lastRenderedPageBreak/>
+        <w:t>Compilation :</w:t>
+      </w:r>
+    </w:p>
+    <w:p>
+      <w:pPr>
+        <w:pStyle w:val="ListParagraph"/>
+        <w:rPr>
+          <w:b/>
+          <w:bCs/>
+        </w:rPr>
+      </w:pPr>
+    </w:p>
+    <w:p>
+      <w:pPr>
+        <w:pStyle w:val="ListParagraph"/>
+      </w:pPr>
+      <w:r>
+        <w:rPr>
+          <w:noProof/>
+        </w:rPr>
+        <w:drawing>
+          <wp:inline distT="0" distB="0" distL="0" distR="0" wp14:anchorId="41308002" wp14:editId="778B4965">
+            <wp:extent cx="5731510" cy="3220085"/>
+            <wp:effectExtent l="0" t="0" r="2540" b="0"/>
+            <wp:docPr id="1823169598" name="Picture 3"/>
+            <wp:cNvGraphicFramePr>
+              <a:graphicFrameLocks xmlns:a="http://schemas.openxmlformats.org/drawingml/2006/main" noChangeAspect="1"/>
+            </wp:cNvGraphicFramePr>
+            <a:graphic xmlns:a="http://schemas.openxmlformats.org/drawingml/2006/main">
+              <a:graphicData uri="http://schemas.openxmlformats.org/drawingml/2006/picture">
+                <pic:pic xmlns:pic="http://schemas.openxmlformats.org/drawingml/2006/picture">
+                  <pic:nvPicPr>
+                    <pic:cNvPr id="0" name="Picture 5"/>
+                    <pic:cNvPicPr>
+                      <a:picLocks noChangeAspect="1" noChangeArrowheads="1"/>
+                    </pic:cNvPicPr>
+                  </pic:nvPicPr>
+                  <pic:blipFill>
+                    <a:blip r:embed="rId9" cstate="print">
+                      <a:extLst>
+                        <a:ext uri="{28A0092B-C50C-407E-A947-70E740481C1C}">
+                          <a14:useLocalDpi xmlns:a14="http://schemas.microsoft.com/office/drawing/2010/main" val="0"/>
+                        </a:ext>
+                      </a:extLst>
+                    </a:blip>
+                    <a:srcRect/>
+                    <a:stretch>
+                      <a:fillRect/>
+                    </a:stretch>
+                  </pic:blipFill>
+                  <pic:spPr bwMode="auto">
+                    <a:xfrm>
+                      <a:off x="0" y="0"/>
+                      <a:ext cx="5731510" cy="3220085"/>
+                    </a:xfrm>
+                    <a:prstGeom prst="rect">
+                      <a:avLst/>
+                    </a:prstGeom>
+                    <a:noFill/>
+                    <a:ln>
+                      <a:noFill/>
+                    </a:ln>
+                  </pic:spPr>
+                </pic:pic>
+              </a:graphicData>
+            </a:graphic>
+          </wp:inline>
+        </w:drawing>
+      </w:r>
+    </w:p>
+    <w:p>
+      <w:pPr>
+        <w:pStyle w:val="ListParagraph"/>
+      </w:pPr>
+    </w:p>
+    <w:p>
+      <w:pPr>
+        <w:pStyle w:val="ListParagraph"/>
+      </w:pPr>
+    </w:p>
+    <w:p>
+      <w:pPr>
+        <w:pStyle w:val="ListParagraph"/>
+        <w:rPr>
+          <w:b/>
+          <w:bCs/>
+        </w:rPr>
+      </w:pPr>
+      <w:r>
+        <w:rPr>
+          <w:b/>
+          <w:bCs/>
+        </w:rPr>
+        <w:t>Simulation :</w:t>
+      </w:r>
+    </w:p>
+    <w:p>
+      <w:pPr>
+        <w:pStyle w:val="ListParagraph"/>
+        <w:rPr>
+          <w:b/>
+          <w:bCs/>
+        </w:rPr>
+      </w:pPr>
+    </w:p>
+    <w:p>
+      <w:pPr>
+        <w:pStyle w:val="ListParagraph"/>
+        <w:rPr>
+          <w:b/>
+          <w:bCs/>
+        </w:rPr>
+      </w:pPr>
+      <w:r>
+        <w:rPr>
+          <w:noProof/>
+        </w:rPr>
+        <w:drawing>
+          <wp:inline distT="0" distB="0" distL="0" distR="0" wp14:anchorId="7058096C" wp14:editId="5A213FA3">
+            <wp:extent cx="5731510" cy="3220085"/>
+            <wp:effectExtent l="0" t="0" r="2540" b="0"/>
+            <wp:docPr id="1336011071" name="Picture 4"/>
+            <wp:cNvGraphicFramePr>
+              <a:graphicFrameLocks xmlns:a="http://schemas.openxmlformats.org/drawingml/2006/main" noChangeAspect="1"/>
+            </wp:cNvGraphicFramePr>
+            <a:graphic xmlns:a="http://schemas.openxmlformats.org/drawingml/2006/main">
+              <a:graphicData uri="http://schemas.openxmlformats.org/drawingml/2006/picture">
+                <pic:pic xmlns:pic="http://schemas.openxmlformats.org/drawingml/2006/picture">
+                  <pic:nvPicPr>
+                    <pic:cNvPr id="0" name="Picture 7"/>
+                    <pic:cNvPicPr>
+                      <a:picLocks noChangeAspect="1" noChangeArrowheads="1"/>
+                    </pic:cNvPicPr>
+                  </pic:nvPicPr>
+                  <pic:blipFill>
+                    <a:blip r:embed="rId10" cstate="print">
+                      <a:extLst>
+                        <a:ext uri="{28A0092B-C50C-407E-A947-70E740481C1C}">
+                          <a14:useLocalDpi xmlns:a14="http://schemas.microsoft.com/office/drawing/2010/main" val="0"/>
+                        </a:ext>
+                      </a:extLst>
+                    </a:blip>
+                    <a:srcRect/>
+                    <a:stretch>
+                      <a:fillRect/>
+                    </a:stretch>
+                  </pic:blipFill>
+                  <pic:spPr bwMode="auto">
+                    <a:xfrm>
+                      <a:off x="0" y="0"/>
+                      <a:ext cx="5731510" cy="3220085"/>
+                    </a:xfrm>
+                    <a:prstGeom prst="rect">
+                      <a:avLst/>
+                    </a:prstGeom>
+                    <a:noFill/>
+                    <a:ln>
+                      <a:noFill/>
+                    </a:ln>
+                  </pic:spPr>
+                </pic:pic>
+              </a:graphicData>
+            </a:graphic>
+          </wp:inline>
+        </w:drawing>
+      </w:r>
+    </w:p>
+    <w:p>
+      <w:pPr>
+        <w:pStyle w:val="ListParagraph"/>
+        <w:rPr>
+          <w:b/>
+          <w:bCs/>
+        </w:rPr>
+      </w:pPr>
     </w:p>
     <w:p>
       <w:pPr>
@@ -1811,6 +2105,29 @@
       <w:spacing w:val="5"/>
     </w:rPr>
   </w:style>
+  <w:style w:type="character" w:styleId="Hyperlink">
+    <w:name w:val="Hyperlink"/>
+    <w:basedOn w:val="DefaultParagraphFont"/>
+    <w:uiPriority w:val="99"/>
+    <w:unhideWhenUsed/>
+    <w:rsid w:val="00F502CC"/>
+    <w:rPr>
+      <w:color w:val="0563C1" w:themeColor="hyperlink"/>
+      <w:u w:val="single"/>
+    </w:rPr>
+  </w:style>
+  <w:style w:type="character" w:styleId="UnresolvedMention">
+    <w:name w:val="Unresolved Mention"/>
+    <w:basedOn w:val="DefaultParagraphFont"/>
+    <w:uiPriority w:val="99"/>
+    <w:semiHidden/>
+    <w:unhideWhenUsed/>
+    <w:rsid w:val="00F502CC"/>
+    <w:rPr>
+      <w:color w:val="605E5C"/>
+      <w:shd w:val="clear" w:color="auto" w:fill="E1DFDD"/>
+    </w:rPr>
+  </w:style>
 </w:styles>
 </file>
 

</xml_diff>